<commit_message>
Update variogram analysis + kriging code
</commit_message>
<xml_diff>
--- a/Notes/Variogram_analysis.docx
+++ b/Notes/Variogram_analysis.docx
@@ -43,6 +43,7 @@
         <w:rPr>
           <w:b/>
           <w:bCs/>
+          <w:highlight w:val="cyan"/>
         </w:rPr>
         <w:t>Monsoon</w:t>
       </w:r>
@@ -65,6 +66,43 @@
     <w:p>
       <w:r>
         <w:t>Trend Surface Fit (R²): 0.0362</w:t>
+      </w:r>
+    </w:p>
+    <w:p>
+      <w:r>
+        <w:t>Linear regression equation: y = B1 (</w:t>
+      </w:r>
+      <w:proofErr w:type="spellStart"/>
+      <w:r>
+        <w:t>lat</w:t>
+      </w:r>
+      <w:proofErr w:type="spellEnd"/>
+      <w:r>
+        <w:t>) + B2 (</w:t>
+      </w:r>
+      <w:proofErr w:type="spellStart"/>
+      <w:r>
+        <w:t>lon</w:t>
+      </w:r>
+      <w:proofErr w:type="spellEnd"/>
+      <w:r>
+        <w:t>) + intercept =</w:t>
+      </w:r>
+      <w:proofErr w:type="gramStart"/>
+      <w:r>
+        <w:t>=  y</w:t>
+      </w:r>
+      <w:proofErr w:type="gramEnd"/>
+      <w:r>
+        <w:t xml:space="preserve"> = -79.2576*(</w:t>
+      </w:r>
+      <w:proofErr w:type="spellStart"/>
+      <w:r>
+        <w:t>lat</w:t>
+      </w:r>
+      <w:proofErr w:type="spellEnd"/>
+      <w:r>
+        <w:t>) + 16.4877*(long) + 2026.6630</w:t>
       </w:r>
     </w:p>
     <w:p>
@@ -75,7 +113,15 @@
         <w:t>ℹ</w:t>
       </w:r>
       <w:r>
-        <w:t xml:space="preserve"> Weak spatial trend but removing for consistency.</w:t>
+        <w:t xml:space="preserve"> Weak spatial </w:t>
+      </w:r>
+      <w:proofErr w:type="gramStart"/>
+      <w:r>
+        <w:t>trend, but</w:t>
+      </w:r>
+      <w:proofErr w:type="gramEnd"/>
+      <w:r>
+        <w:t xml:space="preserve"> removing for consistency.</w:t>
       </w:r>
     </w:p>
     <w:p>
@@ -449,6 +495,7 @@
         <w:rPr>
           <w:b/>
           <w:bCs/>
+          <w:highlight w:val="cyan"/>
         </w:rPr>
         <w:t>Post-monsoon</w:t>
       </w:r>
@@ -474,6 +521,43 @@
     <w:p>
       <w:r>
         <w:t>Trend Surface Fit (R²): 0.2184</w:t>
+      </w:r>
+    </w:p>
+    <w:p>
+      <w:r>
+        <w:t>Linear regression equation: y = B1 (</w:t>
+      </w:r>
+      <w:proofErr w:type="spellStart"/>
+      <w:r>
+        <w:t>lat</w:t>
+      </w:r>
+      <w:proofErr w:type="spellEnd"/>
+      <w:r>
+        <w:t>) + B2 (</w:t>
+      </w:r>
+      <w:proofErr w:type="spellStart"/>
+      <w:r>
+        <w:t>lon</w:t>
+      </w:r>
+      <w:proofErr w:type="spellEnd"/>
+      <w:r>
+        <w:t>) + intercept =</w:t>
+      </w:r>
+      <w:proofErr w:type="gramStart"/>
+      <w:r>
+        <w:t>=  y</w:t>
+      </w:r>
+      <w:proofErr w:type="gramEnd"/>
+      <w:r>
+        <w:t xml:space="preserve"> = -3.6445*(</w:t>
+      </w:r>
+      <w:proofErr w:type="spellStart"/>
+      <w:r>
+        <w:t>lat</w:t>
+      </w:r>
+      <w:proofErr w:type="spellEnd"/>
+      <w:r>
+        <w:t>) + 3.7202*(long) + -156.1296</w:t>
       </w:r>
     </w:p>
     <w:p>
@@ -481,6 +565,7 @@
         <w:rPr>
           <w:rFonts w:ascii="Segoe UI Symbol" w:hAnsi="Segoe UI Symbol" w:cs="Segoe UI Symbol"/>
         </w:rPr>
+        <w:lastRenderedPageBreak/>
         <w:t>✓</w:t>
       </w:r>
       <w:r>
@@ -728,7 +813,6 @@
           </w:tcPr>
           <w:p>
             <w:r>
-              <w:lastRenderedPageBreak/>
               <w:t>Spherical</w:t>
             </w:r>
           </w:p>
@@ -884,6 +968,7 @@
         <w:rPr>
           <w:b/>
           <w:bCs/>
+          <w:highlight w:val="cyan"/>
         </w:rPr>
         <w:t>Winter</w:t>
       </w:r>
@@ -924,6 +1009,43 @@
     <w:p>
       <w:r>
         <w:t>Trend Surface Fit (R²): 0.6960</w:t>
+      </w:r>
+    </w:p>
+    <w:p>
+      <w:r>
+        <w:t>Linear regression equation: y = B1 (</w:t>
+      </w:r>
+      <w:proofErr w:type="spellStart"/>
+      <w:r>
+        <w:t>lat</w:t>
+      </w:r>
+      <w:proofErr w:type="spellEnd"/>
+      <w:r>
+        <w:t>) + B2 (</w:t>
+      </w:r>
+      <w:proofErr w:type="spellStart"/>
+      <w:r>
+        <w:t>lon</w:t>
+      </w:r>
+      <w:proofErr w:type="spellEnd"/>
+      <w:r>
+        <w:t>) + intercept =</w:t>
+      </w:r>
+      <w:proofErr w:type="gramStart"/>
+      <w:r>
+        <w:t>=  y</w:t>
+      </w:r>
+      <w:proofErr w:type="gramEnd"/>
+      <w:r>
+        <w:t xml:space="preserve"> = 25.7005*(</w:t>
+      </w:r>
+      <w:proofErr w:type="spellStart"/>
+      <w:r>
+        <w:t>lat</w:t>
+      </w:r>
+      <w:proofErr w:type="spellEnd"/>
+      <w:r>
+        <w:t>) + -2.1057*(long) + -482.0265</w:t>
       </w:r>
     </w:p>
     <w:p>
@@ -1315,6 +1437,7 @@
         <w:rPr>
           <w:b/>
           <w:bCs/>
+          <w:highlight w:val="cyan"/>
         </w:rPr>
         <w:t>Pre-monsoon</w:t>
       </w:r>
@@ -1331,12 +1454,52 @@
     </w:p>
     <w:p>
       <w:r>
-        <w:t>Trend Surface Fit (R²): 0.6960</w:t>
-      </w:r>
-    </w:p>
-    <w:p>
-      <w:r>
-        <w:t>Sample Variance of Transformed Data: 0.9985</w:t>
+        <w:t>Trend Surface Fit (R²): 0.3944</w:t>
+      </w:r>
+    </w:p>
+    <w:p>
+      <w:r>
+        <w:t>Linear regression equation: y = B1 (</w:t>
+      </w:r>
+      <w:proofErr w:type="spellStart"/>
+      <w:r>
+        <w:t>lat</w:t>
+      </w:r>
+      <w:proofErr w:type="spellEnd"/>
+      <w:r>
+        <w:t>) + B2 (</w:t>
+      </w:r>
+      <w:proofErr w:type="spellStart"/>
+      <w:r>
+        <w:t>lon</w:t>
+      </w:r>
+      <w:proofErr w:type="spellEnd"/>
+      <w:r>
+        <w:t>) + intercept =</w:t>
+      </w:r>
+      <w:proofErr w:type="gramStart"/>
+      <w:r>
+        <w:t>=  y</w:t>
+      </w:r>
+      <w:proofErr w:type="gramEnd"/>
+      <w:r>
+        <w:t xml:space="preserve"> = 43.9990*(</w:t>
+      </w:r>
+      <w:proofErr w:type="spellStart"/>
+      <w:r>
+        <w:t>lat</w:t>
+      </w:r>
+      <w:proofErr w:type="spellEnd"/>
+      <w:r>
+        <w:t>) + 35.0136*(long) + -3991.7142</w:t>
+      </w:r>
+    </w:p>
+    <w:p>
+      <w:r>
+        <w:t>Sample Variance of Transformed Data: 0.9</w:t>
+      </w:r>
+      <w:r>
+        <w:t>420</w:t>
       </w:r>
     </w:p>
     <w:p>
@@ -1344,6 +1507,7 @@
         <w:rPr>
           <w:rFonts w:ascii="Segoe UI Symbol" w:hAnsi="Segoe UI Symbol" w:cs="Segoe UI Symbol"/>
         </w:rPr>
+        <w:lastRenderedPageBreak/>
         <w:t>✓</w:t>
       </w:r>
       <w:r>
@@ -1549,17 +1713,17 @@
           </w:tcPr>
           <w:p>
             <w:r>
-              <w:t>0.658</w:t>
-            </w:r>
-          </w:p>
-        </w:tc>
-        <w:tc>
-          <w:tcPr>
-            <w:tcW w:w="1558" w:type="dxa"/>
-          </w:tcPr>
-          <w:p>
-            <w:r>
-              <w:t>17.9</w:t>
+              <w:t>1.083</w:t>
+            </w:r>
+          </w:p>
+        </w:tc>
+        <w:tc>
+          <w:tcPr>
+            <w:tcW w:w="1558" w:type="dxa"/>
+          </w:tcPr>
+          <w:p>
+            <w:r>
+              <w:t>20.1</w:t>
             </w:r>
           </w:p>
         </w:tc>
@@ -1569,7 +1733,10 @@
           </w:tcPr>
           <w:p>
             <w:r>
-              <w:t>0.074</w:t>
+              <w:t>0.</w:t>
+            </w:r>
+            <w:r>
+              <w:t>045</w:t>
             </w:r>
           </w:p>
         </w:tc>
@@ -1579,7 +1746,10 @@
           </w:tcPr>
           <w:p>
             <w:r>
-              <w:t>0.365</w:t>
+              <w:t>0.</w:t>
+            </w:r>
+            <w:r>
+              <w:t>416</w:t>
             </w:r>
           </w:p>
         </w:tc>
@@ -1601,27 +1771,43 @@
           </w:tcPr>
           <w:p>
             <w:r>
+              <w:t>0</w:t>
+            </w:r>
+            <w:r>
+              <w:t>.0</w:t>
+            </w:r>
+          </w:p>
+        </w:tc>
+        <w:tc>
+          <w:tcPr>
+            <w:tcW w:w="1558" w:type="dxa"/>
+          </w:tcPr>
+          <w:p>
+            <w:r>
+              <w:t>1.024</w:t>
+            </w:r>
+          </w:p>
+        </w:tc>
+        <w:tc>
+          <w:tcPr>
+            <w:tcW w:w="1558" w:type="dxa"/>
+          </w:tcPr>
+          <w:p>
+            <w:r>
+              <w:t>25.2</w:t>
+            </w:r>
+          </w:p>
+        </w:tc>
+        <w:tc>
+          <w:tcPr>
+            <w:tcW w:w="1559" w:type="dxa"/>
+          </w:tcPr>
+          <w:p>
+            <w:r>
               <w:t>0.0</w:t>
             </w:r>
-          </w:p>
-        </w:tc>
-        <w:tc>
-          <w:tcPr>
-            <w:tcW w:w="1558" w:type="dxa"/>
-          </w:tcPr>
-          <w:p>
-            <w:r>
-              <w:t>0.624</w:t>
-            </w:r>
-          </w:p>
-        </w:tc>
-        <w:tc>
-          <w:tcPr>
-            <w:tcW w:w="1558" w:type="dxa"/>
-          </w:tcPr>
-          <w:p>
-            <w:r>
-              <w:t>21.8</w:t>
+            <w:r>
+              <w:t>74</w:t>
             </w:r>
           </w:p>
         </w:tc>
@@ -1631,17 +1817,10 @@
           </w:tcPr>
           <w:p>
             <w:r>
-              <w:t>0.042</w:t>
-            </w:r>
-          </w:p>
-        </w:tc>
-        <w:tc>
-          <w:tcPr>
-            <w:tcW w:w="1559" w:type="dxa"/>
-          </w:tcPr>
-          <w:p>
-            <w:r>
-              <w:t>0.371</w:t>
+              <w:t>0.</w:t>
+            </w:r>
+            <w:r>
+              <w:t>410</w:t>
             </w:r>
           </w:p>
         </w:tc>
@@ -1673,17 +1852,17 @@
           </w:tcPr>
           <w:p>
             <w:r>
-              <w:t>0.676</w:t>
-            </w:r>
-          </w:p>
-        </w:tc>
-        <w:tc>
-          <w:tcPr>
-            <w:tcW w:w="1558" w:type="dxa"/>
-          </w:tcPr>
-          <w:p>
-            <w:r>
-              <w:t>36.8</w:t>
+              <w:t>1.117</w:t>
+            </w:r>
+          </w:p>
+        </w:tc>
+        <w:tc>
+          <w:tcPr>
+            <w:tcW w:w="1558" w:type="dxa"/>
+          </w:tcPr>
+          <w:p>
+            <w:r>
+              <w:t>43.6</w:t>
             </w:r>
           </w:p>
         </w:tc>
@@ -1693,7 +1872,7 @@
           </w:tcPr>
           <w:p>
             <w:r>
-              <w:t>0.048</w:t>
+              <w:t>-0.096</w:t>
             </w:r>
           </w:p>
         </w:tc>
@@ -1703,7 +1882,10 @@
           </w:tcPr>
           <w:p>
             <w:r>
-              <w:t>0.370</w:t>
+              <w:t>0.</w:t>
+            </w:r>
+            <w:r>
+              <w:t>446</w:t>
             </w:r>
           </w:p>
         </w:tc>
@@ -2338,7 +2520,6 @@
   <w:style w:type="character" w:default="1" w:styleId="DefaultParagraphFont">
     <w:name w:val="Default Paragraph Font"/>
     <w:uiPriority w:val="1"/>
-    <w:semiHidden/>
     <w:unhideWhenUsed/>
   </w:style>
   <w:style w:type="table" w:default="1" w:styleId="TableNormal">

</xml_diff>